<commit_message>
Added a Regression Tree model which has income dataset
</commit_message>
<xml_diff>
--- a/ML with python - Decision -trees/ML with python - Decision Trees.docx
+++ b/ML with python - Decision -trees/ML with python - Decision Trees.docx
@@ -481,7 +481,31 @@
           <w:lang w:eastAsia="en-IN"/>
           <w14:ligatures w14:val="none"/>
         </w:rPr>
-        <w:t> This involves building the full tree and then pruning it back by removing subtrees that don't contribute much to the overall accuracy.</w:t>
+        <w:t xml:space="preserve"> This involves building the full tree and then pruning it back by removing subtrees that </w:t>
+      </w:r>
+      <w:proofErr w:type="gramStart"/>
+      <w:r>
+        <w:rPr>
+          <w:rFonts w:eastAsia="Times New Roman" w:cstheme="minorHAnsi"/>
+          <w:color w:val="000000" w:themeColor="text1"/>
+          <w:spacing w:val="2"/>
+          <w:kern w:val="0"/>
+          <w:lang w:eastAsia="en-IN"/>
+          <w14:ligatures w14:val="none"/>
+        </w:rPr>
+        <w:t>don't</w:t>
+      </w:r>
+      <w:proofErr w:type="gramEnd"/>
+      <w:r>
+        <w:rPr>
+          <w:rFonts w:eastAsia="Times New Roman" w:cstheme="minorHAnsi"/>
+          <w:color w:val="000000" w:themeColor="text1"/>
+          <w:spacing w:val="2"/>
+          <w:kern w:val="0"/>
+          <w:lang w:eastAsia="en-IN"/>
+          <w14:ligatures w14:val="none"/>
+        </w:rPr>
+        <w:t xml:space="preserve"> contribute much to the overall accuracy.</w:t>
       </w:r>
     </w:p>
     <w:p>
@@ -545,22 +569,228 @@
         <w:spacing w:after="0" w:line="330" w:lineRule="atLeast"/>
         <w:rPr>
           <w:rFonts w:eastAsia="Times New Roman" w:cstheme="minorHAnsi"/>
-          <w:color w:val="000000" w:themeColor="text1"/>
-          <w:kern w:val="0"/>
-          <w:lang w:eastAsia="en-IN"/>
-          <w14:ligatures w14:val="none"/>
-        </w:rPr>
-      </w:pPr>
-      <w:r>
-        <w:rPr>
-          <w:rFonts w:eastAsia="Times New Roman" w:cstheme="minorHAnsi"/>
-          <w:color w:val="000000" w:themeColor="text1"/>
-          <w:spacing w:val="2"/>
-          <w:kern w:val="0"/>
-          <w:lang w:eastAsia="en-IN"/>
-          <w14:ligatures w14:val="none"/>
-        </w:rPr>
-        <w:t>If training data is passed to model, then the model score is high and if test data is passed to the model the model score is relatively low</w:t>
+          <w:b/>
+          <w:bCs/>
+          <w:color w:val="000000" w:themeColor="text1"/>
+          <w:spacing w:val="2"/>
+          <w:kern w:val="0"/>
+          <w:lang w:eastAsia="en-IN"/>
+          <w14:ligatures w14:val="none"/>
+        </w:rPr>
+      </w:pPr>
+      <w:r>
+        <w:rPr>
+          <w:rFonts w:eastAsia="Times New Roman" w:cstheme="minorHAnsi"/>
+          <w:color w:val="000000" w:themeColor="text1"/>
+          <w:spacing w:val="2"/>
+          <w:kern w:val="0"/>
+          <w:lang w:eastAsia="en-IN"/>
+          <w14:ligatures w14:val="none"/>
+        </w:rPr>
+        <w:t xml:space="preserve">If </w:t>
+      </w:r>
+      <w:r>
+        <w:rPr>
+          <w:rFonts w:eastAsia="Times New Roman" w:cstheme="minorHAnsi"/>
+          <w:b/>
+          <w:bCs/>
+          <w:color w:val="000000" w:themeColor="text1"/>
+          <w:spacing w:val="2"/>
+          <w:kern w:val="0"/>
+          <w:lang w:eastAsia="en-IN"/>
+          <w14:ligatures w14:val="none"/>
+        </w:rPr>
+        <w:t>training data</w:t>
+      </w:r>
+      <w:r>
+        <w:rPr>
+          <w:rFonts w:eastAsia="Times New Roman" w:cstheme="minorHAnsi"/>
+          <w:color w:val="000000" w:themeColor="text1"/>
+          <w:spacing w:val="2"/>
+          <w:kern w:val="0"/>
+          <w:lang w:eastAsia="en-IN"/>
+          <w14:ligatures w14:val="none"/>
+        </w:rPr>
+        <w:t xml:space="preserve"> is passed to model, then the model score is high and if test data is passed to the model the model score is </w:t>
+      </w:r>
+      <w:r>
+        <w:rPr>
+          <w:rFonts w:eastAsia="Times New Roman" w:cstheme="minorHAnsi"/>
+          <w:b/>
+          <w:bCs/>
+          <w:color w:val="000000" w:themeColor="text1"/>
+          <w:spacing w:val="2"/>
+          <w:kern w:val="0"/>
+          <w:lang w:eastAsia="en-IN"/>
+          <w14:ligatures w14:val="none"/>
+        </w:rPr>
+        <w:t>relatively low</w:t>
+      </w:r>
+    </w:p>
+    <w:p>
+      <w:pPr>
+        <w:shd w:val="clear" w:color="auto" w:fill="FFFFFF"/>
+        <w:spacing w:after="0" w:line="330" w:lineRule="atLeast"/>
+        <w:rPr>
+          <w:rFonts w:eastAsia="Times New Roman" w:cstheme="minorHAnsi"/>
+          <w:b/>
+          <w:bCs/>
+          <w:color w:val="000000" w:themeColor="text1"/>
+          <w:spacing w:val="2"/>
+          <w:kern w:val="0"/>
+          <w:lang w:eastAsia="en-IN"/>
+          <w14:ligatures w14:val="none"/>
+        </w:rPr>
+      </w:pPr>
+    </w:p>
+    <w:p>
+      <w:pPr>
+        <w:shd w:val="clear" w:color="auto" w:fill="FFFFFF"/>
+        <w:spacing w:after="0" w:line="330" w:lineRule="atLeast"/>
+        <w:rPr>
+          <w:rFonts w:eastAsia="Times New Roman" w:cstheme="minorHAnsi"/>
+          <w:b/>
+          <w:bCs/>
+          <w:color w:val="000000" w:themeColor="text1"/>
+          <w:spacing w:val="2"/>
+          <w:kern w:val="0"/>
+          <w:lang w:eastAsia="en-IN"/>
+          <w14:ligatures w14:val="none"/>
+        </w:rPr>
+      </w:pPr>
+      <w:r>
+        <w:rPr>
+          <w:rFonts w:eastAsia="Times New Roman" w:cstheme="minorHAnsi"/>
+          <w:b/>
+          <w:bCs/>
+          <w:color w:val="000000" w:themeColor="text1"/>
+          <w:spacing w:val="2"/>
+          <w:kern w:val="0"/>
+          <w:lang w:eastAsia="en-IN"/>
+          <w14:ligatures w14:val="none"/>
+        </w:rPr>
+        <w:lastRenderedPageBreak/>
+        <w:t xml:space="preserve">Note: </w:t>
+      </w:r>
+    </w:p>
+    <w:p>
+      <w:pPr>
+        <w:shd w:val="clear" w:color="auto" w:fill="FFFFFF"/>
+        <w:spacing w:after="0" w:line="330" w:lineRule="atLeast"/>
+        <w:rPr>
+          <w:rFonts w:eastAsia="Times New Roman" w:cstheme="minorHAnsi"/>
+          <w:color w:val="000000" w:themeColor="text1"/>
+          <w:kern w:val="0"/>
+          <w:lang w:eastAsia="en-IN"/>
+          <w14:ligatures w14:val="none"/>
+        </w:rPr>
+      </w:pPr>
+      <w:r>
+        <w:rPr>
+          <w:rFonts w:eastAsia="Times New Roman" w:cstheme="minorHAnsi"/>
+          <w:color w:val="000000" w:themeColor="text1"/>
+          <w:spacing w:val="2"/>
+          <w:kern w:val="0"/>
+          <w:lang w:eastAsia="en-IN"/>
+          <w14:ligatures w14:val="none"/>
+        </w:rPr>
+        <w:t xml:space="preserve">Regression Trees of </w:t>
+      </w:r>
+      <w:proofErr w:type="spellStart"/>
+      <w:r>
+        <w:rPr>
+          <w:rFonts w:eastAsia="Times New Roman" w:cstheme="minorHAnsi"/>
+          <w:color w:val="000000" w:themeColor="text1"/>
+          <w:spacing w:val="2"/>
+          <w:kern w:val="0"/>
+          <w:lang w:eastAsia="en-IN"/>
+          <w14:ligatures w14:val="none"/>
+        </w:rPr>
+        <w:t>Sklearn</w:t>
+      </w:r>
+      <w:proofErr w:type="spellEnd"/>
+      <w:r>
+        <w:rPr>
+          <w:rFonts w:eastAsia="Times New Roman" w:cstheme="minorHAnsi"/>
+          <w:color w:val="000000" w:themeColor="text1"/>
+          <w:spacing w:val="2"/>
+          <w:kern w:val="0"/>
+          <w:lang w:eastAsia="en-IN"/>
+          <w14:ligatures w14:val="none"/>
+        </w:rPr>
+        <w:t xml:space="preserve"> package </w:t>
+      </w:r>
+      <w:proofErr w:type="gramStart"/>
+      <w:r>
+        <w:rPr>
+          <w:rFonts w:eastAsia="Times New Roman" w:cstheme="minorHAnsi"/>
+          <w:color w:val="000000" w:themeColor="text1"/>
+          <w:spacing w:val="2"/>
+          <w:kern w:val="0"/>
+          <w:lang w:eastAsia="en-IN"/>
+          <w14:ligatures w14:val="none"/>
+        </w:rPr>
+        <w:t>doesn’t</w:t>
+      </w:r>
+      <w:proofErr w:type="gramEnd"/>
+      <w:r>
+        <w:rPr>
+          <w:rFonts w:eastAsia="Times New Roman" w:cstheme="minorHAnsi"/>
+          <w:color w:val="000000" w:themeColor="text1"/>
+          <w:spacing w:val="2"/>
+          <w:kern w:val="0"/>
+          <w:lang w:eastAsia="en-IN"/>
+          <w14:ligatures w14:val="none"/>
+        </w:rPr>
+        <w:t xml:space="preserve"> fit value non-numeric values. So, the data must be converted to 0’s and 1’s. (use </w:t>
+      </w:r>
+      <w:proofErr w:type="spellStart"/>
+      <w:r>
+        <w:rPr>
+          <w:rFonts w:eastAsia="Times New Roman" w:cstheme="minorHAnsi"/>
+          <w:color w:val="000000" w:themeColor="text1"/>
+          <w:spacing w:val="2"/>
+          <w:kern w:val="0"/>
+          <w:lang w:eastAsia="en-IN"/>
+          <w14:ligatures w14:val="none"/>
+        </w:rPr>
+        <w:t>get_dummies</w:t>
+      </w:r>
+      <w:proofErr w:type="spellEnd"/>
+      <w:r>
+        <w:rPr>
+          <w:rFonts w:eastAsia="Times New Roman" w:cstheme="minorHAnsi"/>
+          <w:color w:val="000000" w:themeColor="text1"/>
+          <w:spacing w:val="2"/>
+          <w:kern w:val="0"/>
+          <w:lang w:eastAsia="en-IN"/>
+          <w14:ligatures w14:val="none"/>
+        </w:rPr>
+        <w:t xml:space="preserve"> method along with </w:t>
+      </w:r>
+      <w:proofErr w:type="spellStart"/>
+      <w:r>
+        <w:rPr>
+          <w:rFonts w:eastAsia="Times New Roman" w:cstheme="minorHAnsi"/>
+          <w:color w:val="000000" w:themeColor="text1"/>
+          <w:spacing w:val="2"/>
+          <w:kern w:val="0"/>
+          <w:lang w:eastAsia="en-IN"/>
+          <w14:ligatures w14:val="none"/>
+        </w:rPr>
+        <w:t>astype</w:t>
+      </w:r>
+      <w:proofErr w:type="spellEnd"/>
+      <w:r>
+        <w:rPr>
+          <w:rFonts w:eastAsia="Times New Roman" w:cstheme="minorHAnsi"/>
+          <w:color w:val="000000" w:themeColor="text1"/>
+          <w:spacing w:val="2"/>
+          <w:kern w:val="0"/>
+          <w:lang w:eastAsia="en-IN"/>
+          <w14:ligatures w14:val="none"/>
+        </w:rPr>
+        <w:t xml:space="preserve"> method)</w:t>
       </w:r>
     </w:p>
     <w:p>

</xml_diff>

<commit_message>
Pre and Post Pruning of Decision Trees
</commit_message>
<xml_diff>
--- a/ML with python - Decision -trees/ML with python - Decision Trees.docx
+++ b/ML with python - Decision -trees/ML with python - Decision Trees.docx
@@ -680,6 +680,7 @@
         <w:rPr>
           <w:rFonts w:eastAsia="Times New Roman" w:cstheme="minorHAnsi"/>
           <w:color w:val="000000" w:themeColor="text1"/>
+          <w:spacing w:val="2"/>
           <w:kern w:val="0"/>
           <w:lang w:eastAsia="en-IN"/>
           <w14:ligatures w14:val="none"/>
@@ -795,12 +796,454 @@
     </w:p>
     <w:p>
       <w:pPr>
-        <w:rPr>
-          <w:rFonts w:cstheme="minorHAnsi"/>
-          <w:color w:val="000000" w:themeColor="text1"/>
-          <w:lang w:val="en-US"/>
-        </w:rPr>
-      </w:pPr>
+        <w:shd w:val="clear" w:color="auto" w:fill="FFFFFF"/>
+        <w:spacing w:after="0" w:line="330" w:lineRule="atLeast"/>
+        <w:rPr>
+          <w:rFonts w:eastAsia="Times New Roman" w:cstheme="minorHAnsi"/>
+          <w:color w:val="000000" w:themeColor="text1"/>
+          <w:spacing w:val="2"/>
+          <w:kern w:val="0"/>
+          <w:lang w:eastAsia="en-IN"/>
+          <w14:ligatures w14:val="none"/>
+        </w:rPr>
+      </w:pPr>
+    </w:p>
+    <w:p>
+      <w:pPr>
+        <w:shd w:val="clear" w:color="auto" w:fill="FFFFFF"/>
+        <w:spacing w:after="0" w:line="330" w:lineRule="atLeast"/>
+        <w:rPr>
+          <w:rFonts w:eastAsia="Times New Roman" w:cstheme="minorHAnsi"/>
+          <w:b/>
+          <w:bCs/>
+          <w:color w:val="000000" w:themeColor="text1"/>
+          <w:kern w:val="0"/>
+          <w:lang w:eastAsia="en-IN"/>
+          <w14:ligatures w14:val="none"/>
+        </w:rPr>
+      </w:pPr>
+      <w:r>
+        <w:rPr>
+          <w:rFonts w:eastAsia="Times New Roman" w:cstheme="minorHAnsi"/>
+          <w:b/>
+          <w:bCs/>
+          <w:color w:val="000000" w:themeColor="text1"/>
+          <w:spacing w:val="2"/>
+          <w:kern w:val="0"/>
+          <w:lang w:eastAsia="en-IN"/>
+          <w14:ligatures w14:val="none"/>
+        </w:rPr>
+        <w:t xml:space="preserve">Feature </w:t>
+      </w:r>
+      <w:proofErr w:type="spellStart"/>
+      <w:r>
+        <w:rPr>
+          <w:rFonts w:eastAsia="Times New Roman" w:cstheme="minorHAnsi"/>
+          <w:b/>
+          <w:bCs/>
+          <w:color w:val="000000" w:themeColor="text1"/>
+          <w:spacing w:val="2"/>
+          <w:kern w:val="0"/>
+          <w:lang w:eastAsia="en-IN"/>
+          <w14:ligatures w14:val="none"/>
+        </w:rPr>
+        <w:t>Importances</w:t>
+      </w:r>
+      <w:proofErr w:type="spellEnd"/>
+      <w:r>
+        <w:rPr>
+          <w:rFonts w:eastAsia="Times New Roman" w:cstheme="minorHAnsi"/>
+          <w:b/>
+          <w:bCs/>
+          <w:color w:val="000000" w:themeColor="text1"/>
+          <w:spacing w:val="2"/>
+          <w:kern w:val="0"/>
+          <w:lang w:eastAsia="en-IN"/>
+          <w14:ligatures w14:val="none"/>
+        </w:rPr>
+        <w:t>:</w:t>
+      </w:r>
+    </w:p>
+    <w:p>
+      <w:pPr>
+        <w:rPr>
+          <w:rFonts w:cstheme="minorHAnsi"/>
+          <w:color w:val="000000" w:themeColor="text1"/>
+          <w:lang w:val="en-US"/>
+        </w:rPr>
+      </w:pPr>
+      <w:r>
+        <w:rPr>
+          <w:rFonts w:cstheme="minorHAnsi"/>
+          <w:color w:val="000000" w:themeColor="text1"/>
+          <w:lang w:val="en-US"/>
+        </w:rPr>
+        <w:t xml:space="preserve">Feature </w:t>
+      </w:r>
+      <w:proofErr w:type="spellStart"/>
+      <w:r>
+        <w:rPr>
+          <w:rFonts w:cstheme="minorHAnsi"/>
+          <w:color w:val="000000" w:themeColor="text1"/>
+          <w:lang w:val="en-US"/>
+        </w:rPr>
+        <w:t>Importances</w:t>
+      </w:r>
+      <w:proofErr w:type="spellEnd"/>
+      <w:r>
+        <w:rPr>
+          <w:rFonts w:cstheme="minorHAnsi"/>
+          <w:color w:val="000000" w:themeColor="text1"/>
+          <w:lang w:val="en-US"/>
+        </w:rPr>
+        <w:t xml:space="preserve"> is used to determine the how important is each independent variable in the data set.</w:t>
+      </w:r>
+    </w:p>
+    <w:p>
+      <w:pPr>
+        <w:rPr>
+          <w:rFonts w:cstheme="minorHAnsi"/>
+          <w:color w:val="000000" w:themeColor="text1"/>
+          <w:lang w:val="en-US"/>
+        </w:rPr>
+      </w:pPr>
+      <w:r>
+        <w:rPr>
+          <w:rFonts w:cstheme="minorHAnsi"/>
+          <w:color w:val="000000" w:themeColor="text1"/>
+          <w:lang w:val="en-US"/>
+        </w:rPr>
+        <w:t xml:space="preserve">To know feature </w:t>
+      </w:r>
+      <w:proofErr w:type="spellStart"/>
+      <w:r>
+        <w:rPr>
+          <w:rFonts w:cstheme="minorHAnsi"/>
+          <w:color w:val="000000" w:themeColor="text1"/>
+          <w:lang w:val="en-US"/>
+        </w:rPr>
+        <w:t>importances</w:t>
+      </w:r>
+      <w:proofErr w:type="spellEnd"/>
+      <w:r>
+        <w:rPr>
+          <w:rFonts w:cstheme="minorHAnsi"/>
+          <w:color w:val="000000" w:themeColor="text1"/>
+          <w:lang w:val="en-US"/>
+        </w:rPr>
+        <w:t>, we can just invoke ‘</w:t>
+      </w:r>
+      <w:proofErr w:type="spellStart"/>
+      <w:r>
+        <w:rPr>
+          <w:rFonts w:cstheme="minorHAnsi"/>
+          <w:b/>
+          <w:bCs/>
+          <w:color w:val="000000" w:themeColor="text1"/>
+          <w:lang w:val="en-US"/>
+        </w:rPr>
+        <w:t>feature</w:t>
+      </w:r>
+      <w:r>
+        <w:rPr>
+          <w:rFonts w:cstheme="minorHAnsi"/>
+          <w:color w:val="000000" w:themeColor="text1"/>
+          <w:lang w:val="en-US"/>
+        </w:rPr>
+        <w:t>_</w:t>
+      </w:r>
+      <w:r>
+        <w:rPr>
+          <w:rFonts w:cstheme="minorHAnsi"/>
+          <w:b/>
+          <w:bCs/>
+          <w:color w:val="000000" w:themeColor="text1"/>
+          <w:lang w:val="en-US"/>
+        </w:rPr>
+        <w:t>importances</w:t>
+      </w:r>
+      <w:proofErr w:type="spellEnd"/>
+      <w:r>
+        <w:rPr>
+          <w:rFonts w:cstheme="minorHAnsi"/>
+          <w:b/>
+          <w:bCs/>
+          <w:color w:val="000000" w:themeColor="text1"/>
+          <w:lang w:val="en-US"/>
+        </w:rPr>
+        <w:t>_</w:t>
+      </w:r>
+      <w:r>
+        <w:rPr>
+          <w:rFonts w:cstheme="minorHAnsi"/>
+          <w:color w:val="000000" w:themeColor="text1"/>
+          <w:lang w:val="en-US"/>
+        </w:rPr>
+        <w:t xml:space="preserve">’ method on the model we have built, we will get the array of the features based on their </w:t>
+      </w:r>
+      <w:proofErr w:type="spellStart"/>
+      <w:r>
+        <w:rPr>
+          <w:rFonts w:cstheme="minorHAnsi"/>
+          <w:color w:val="000000" w:themeColor="text1"/>
+          <w:lang w:val="en-US"/>
+        </w:rPr>
+        <w:t>importances</w:t>
+      </w:r>
+      <w:proofErr w:type="spellEnd"/>
+      <w:r>
+        <w:rPr>
+          <w:rFonts w:cstheme="minorHAnsi"/>
+          <w:color w:val="000000" w:themeColor="text1"/>
+          <w:lang w:val="en-US"/>
+        </w:rPr>
+        <w:t xml:space="preserve">. Then we can just plot to understand the feature </w:t>
+      </w:r>
+      <w:proofErr w:type="spellStart"/>
+      <w:r>
+        <w:rPr>
+          <w:rFonts w:cstheme="minorHAnsi"/>
+          <w:color w:val="000000" w:themeColor="text1"/>
+          <w:lang w:val="en-US"/>
+        </w:rPr>
+        <w:t>importances</w:t>
+      </w:r>
+      <w:proofErr w:type="spellEnd"/>
+    </w:p>
+    <w:p>
+      <w:pPr>
+        <w:rPr>
+          <w:rFonts w:cstheme="minorHAnsi"/>
+          <w:color w:val="000000" w:themeColor="text1"/>
+          <w:lang w:val="en-US"/>
+        </w:rPr>
+      </w:pPr>
+    </w:p>
+    <w:p>
+      <w:pPr>
+        <w:rPr>
+          <w:rFonts w:cstheme="minorHAnsi"/>
+          <w:b/>
+          <w:bCs/>
+          <w:color w:val="000000" w:themeColor="text1"/>
+          <w:lang w:val="en-US"/>
+        </w:rPr>
+      </w:pPr>
+      <w:proofErr w:type="spellStart"/>
+      <w:r>
+        <w:rPr>
+          <w:rFonts w:cstheme="minorHAnsi"/>
+          <w:b/>
+          <w:bCs/>
+          <w:color w:val="000000" w:themeColor="text1"/>
+          <w:lang w:val="en-US"/>
+        </w:rPr>
+        <w:t>Pre_pruning</w:t>
+      </w:r>
+      <w:proofErr w:type="spellEnd"/>
+      <w:r>
+        <w:rPr>
+          <w:rFonts w:cstheme="minorHAnsi"/>
+          <w:b/>
+          <w:bCs/>
+          <w:color w:val="000000" w:themeColor="text1"/>
+          <w:lang w:val="en-US"/>
+        </w:rPr>
+        <w:t>:</w:t>
+      </w:r>
+      <w:r>
+        <w:rPr>
+          <w:rFonts w:cstheme="minorHAnsi"/>
+          <w:b/>
+          <w:bCs/>
+          <w:color w:val="000000" w:themeColor="text1"/>
+          <w:lang w:val="en-US"/>
+        </w:rPr>
+        <w:t xml:space="preserve"> </w:t>
+      </w:r>
+      <w:proofErr w:type="spellStart"/>
+      <w:r>
+        <w:rPr>
+          <w:rFonts w:cstheme="minorHAnsi"/>
+          <w:color w:val="000000" w:themeColor="text1"/>
+          <w:lang w:val="en-US"/>
+        </w:rPr>
+        <w:t>GridSearch</w:t>
+      </w:r>
+      <w:proofErr w:type="spellEnd"/>
+      <w:r>
+        <w:rPr>
+          <w:rFonts w:cstheme="minorHAnsi"/>
+          <w:color w:val="000000" w:themeColor="text1"/>
+          <w:lang w:val="en-US"/>
+        </w:rPr>
+        <w:t xml:space="preserve"> CV is used to build the model by pre-pruning the tree in the sense, using parameters to grow the tree.</w:t>
+      </w:r>
+    </w:p>
+    <w:p>
+      <w:pPr>
+        <w:rPr>
+          <w:rFonts w:cstheme="minorHAnsi"/>
+          <w:color w:val="000000" w:themeColor="text1"/>
+          <w:lang w:val="en-US"/>
+        </w:rPr>
+      </w:pPr>
+      <w:r>
+        <w:rPr>
+          <w:rFonts w:cstheme="minorHAnsi"/>
+          <w:b/>
+          <w:bCs/>
+          <w:color w:val="000000" w:themeColor="text1"/>
+          <w:lang w:val="en-US"/>
+        </w:rPr>
+        <w:t>Post-Pruning:</w:t>
+      </w:r>
+      <w:r>
+        <w:rPr>
+          <w:rFonts w:cstheme="minorHAnsi"/>
+          <w:color w:val="000000" w:themeColor="text1"/>
+          <w:lang w:val="en-US"/>
+        </w:rPr>
+        <w:t xml:space="preserve"> Allowing tree to fully grow and then reduce the overfitting. </w:t>
+      </w:r>
+    </w:p>
+    <w:p>
+      <w:proofErr w:type="spellStart"/>
+      <w:r>
+        <w:rPr>
+          <w:rFonts w:cstheme="minorHAnsi"/>
+          <w:b/>
+          <w:bCs/>
+          <w:color w:val="000000" w:themeColor="text1"/>
+          <w:lang w:val="en-US"/>
+        </w:rPr>
+        <w:t>cost_complexity_pruning_</w:t>
+      </w:r>
+      <w:r>
+        <w:rPr>
+          <w:rFonts w:cstheme="minorHAnsi"/>
+          <w:b/>
+          <w:bCs/>
+          <w:color w:val="000000" w:themeColor="text1"/>
+          <w:lang w:val="en-US"/>
+        </w:rPr>
+        <w:t>path</w:t>
+      </w:r>
+      <w:proofErr w:type="spellEnd"/>
+      <w:r>
+        <w:rPr>
+          <w:rFonts w:cstheme="minorHAnsi"/>
+          <w:b/>
+          <w:bCs/>
+          <w:color w:val="000000" w:themeColor="text1"/>
+          <w:lang w:val="en-US"/>
+        </w:rPr>
+        <w:t xml:space="preserve"> </w:t>
+      </w:r>
+      <w:r>
+        <w:rPr>
+          <w:rFonts w:cstheme="minorHAnsi"/>
+          <w:color w:val="000000" w:themeColor="text1"/>
+          <w:lang w:val="en-US"/>
+        </w:rPr>
+        <w:t>method</w:t>
+      </w:r>
+      <w:r>
+        <w:rPr>
+          <w:rFonts w:cstheme="minorHAnsi"/>
+          <w:color w:val="000000" w:themeColor="text1"/>
+          <w:lang w:val="en-US"/>
+        </w:rPr>
+        <w:t xml:space="preserve"> is used to post prune a tree, which takes </w:t>
+      </w:r>
+      <w:proofErr w:type="spellStart"/>
+      <w:r>
+        <w:rPr>
+          <w:rFonts w:cstheme="minorHAnsi"/>
+          <w:color w:val="000000" w:themeColor="text1"/>
+          <w:lang w:val="en-US"/>
+        </w:rPr>
+        <w:t>x_train</w:t>
+      </w:r>
+      <w:proofErr w:type="spellEnd"/>
+      <w:r>
+        <w:rPr>
+          <w:rFonts w:cstheme="minorHAnsi"/>
+          <w:color w:val="000000" w:themeColor="text1"/>
+          <w:lang w:val="en-US"/>
+        </w:rPr>
+        <w:t xml:space="preserve"> and </w:t>
+      </w:r>
+      <w:proofErr w:type="spellStart"/>
+      <w:r>
+        <w:rPr>
+          <w:rFonts w:cstheme="minorHAnsi"/>
+          <w:color w:val="000000" w:themeColor="text1"/>
+          <w:lang w:val="en-US"/>
+        </w:rPr>
+        <w:t>y_train</w:t>
+      </w:r>
+      <w:proofErr w:type="spellEnd"/>
+      <w:r>
+        <w:rPr>
+          <w:rFonts w:cstheme="minorHAnsi"/>
+          <w:color w:val="000000" w:themeColor="text1"/>
+          <w:lang w:val="en-US"/>
+        </w:rPr>
+        <w:t xml:space="preserve"> data</w:t>
+      </w:r>
+      <w:r>
+        <w:rPr>
+          <w:rFonts w:cstheme="minorHAnsi"/>
+          <w:color w:val="000000" w:themeColor="text1"/>
+          <w:lang w:val="en-US"/>
+        </w:rPr>
+        <w:t xml:space="preserve"> as arguments. Now, after the pruning method is applied, we get the </w:t>
+      </w:r>
+      <w:proofErr w:type="spellStart"/>
+      <w:r>
+        <w:rPr>
+          <w:rFonts w:cstheme="minorHAnsi"/>
+          <w:b/>
+          <w:bCs/>
+          <w:color w:val="000000" w:themeColor="text1"/>
+          <w:lang w:val="en-US"/>
+        </w:rPr>
+        <w:t>ccp_alphas</w:t>
+      </w:r>
+      <w:proofErr w:type="spellEnd"/>
+      <w:r>
+        <w:rPr>
+          <w:rFonts w:cstheme="minorHAnsi"/>
+          <w:b/>
+          <w:bCs/>
+          <w:color w:val="000000" w:themeColor="text1"/>
+          <w:lang w:val="en-US"/>
+        </w:rPr>
+        <w:t xml:space="preserve">. </w:t>
+      </w:r>
+      <w:r>
+        <w:t>The higher the alpha values, the smaller the tree would be.</w:t>
+      </w:r>
+      <w:r>
+        <w:t xml:space="preserve"> Then get the </w:t>
+      </w:r>
+      <w:proofErr w:type="spellStart"/>
+      <w:r>
+        <w:t>test_score</w:t>
+      </w:r>
+      <w:proofErr w:type="spellEnd"/>
+      <w:r>
+        <w:t xml:space="preserve"> whose values is highest and the alpha value associated with the </w:t>
+      </w:r>
+      <w:proofErr w:type="spellStart"/>
+      <w:r>
+        <w:t>test_score</w:t>
+      </w:r>
+      <w:proofErr w:type="spellEnd"/>
+      <w:r>
+        <w:t>. This will be the best alpha and can be used for finalizing the model</w:t>
+      </w:r>
     </w:p>
     <w:sectPr>
       <w:pgSz w:w="11906" w:h="16838"/>
@@ -1373,7 +1816,6 @@
   <w:style w:type="character" w:default="1" w:styleId="DefaultParagraphFont">
     <w:name w:val="Default Paragraph Font"/>
     <w:uiPriority w:val="1"/>
-    <w:semiHidden/>
     <w:unhideWhenUsed/>
   </w:style>
   <w:style w:type="table" w:default="1" w:styleId="TableNormal">

</xml_diff>